<commit_message>
Model Kantata OX project writeback and expand assessment report
</commit_message>
<xml_diff>
--- a/ao-vite/public/demo/northstar-data-readiness-assessment.docx
+++ b/ao-vite/public/demo/northstar-data-readiness-assessment.docx
@@ -16,22 +16,18 @@
       </w:pPr>
       <w:r>
         <w:t>Northstar Foods</w:t>
+        <w:br/>
+        <w:t>Decision rights and operating model</w:t>
       </w:r>
     </w:p>
     <w:p>
       <w:r>
         <w:rPr>
-          <w:color w:val="53616A"/>
           <w:sz w:val="18"/>
         </w:rPr>
-        <w:t>Avery Ross  |  Reviewed by Sofia Patel</w:t>
+        <w:t>Prepared by Avery Ross  |  Reviewed by Sofia Patel</w:t>
         <w:br/>
-        <w:t>September 7, 2026  |  Approved revision 2  |  Template ASG DR01 v1.2</w:t>
-      </w:r>
-    </w:p>
-    <w:p>
-      <w:r>
-        <w:t>Proceed with initial diagnostic work for the six supplied regions. Design decisions remain conditional on resolving ownership, currency and the missing regional evidence.</w:t>
+        <w:t>September 7, 2026  |  Approved revision 2</w:t>
       </w:r>
     </w:p>
     <w:p>
@@ -39,12 +35,59 @@
         <w:pStyle w:val="Heading1"/>
       </w:pPr>
       <w:r>
-        <w:t>Purpose and assessment basis</w:t>
+        <w:t>Executive assessment</w:t>
       </w:r>
     </w:p>
     <w:p>
       <w:r>
-        <w:t>Establish which regional evidence can support the decision-rights diagnostic, with observed ownership kept separate from proposed design.</w:t>
+        <w:rPr>
+          <w:b/>
+        </w:rPr>
+        <w:t>Proceed with diagnosis; hold the affected design decisions.</w:t>
+      </w:r>
+    </w:p>
+    <w:p>
+      <w:r>
+        <w:t>The evidence supports a bounded diagnostic, not an eight-region design-readiness conclusion. Six regional extracts have been received. Two absent extracts, incomplete Northeast ownership fields and Central’s older inventory leave material questions about who makes decisions today. These gaps affect the completeness and reliability of the diagnostic baseline; they are not evidence that the proposed operating model is wrong.</w:t>
+      </w:r>
+    </w:p>
+    <w:p>
+      <w:pPr>
+        <w:pStyle w:val="Heading2"/>
+      </w:pPr>
+      <w:r>
+        <w:t>Proceed  Initial diagnostic work</w:t>
+      </w:r>
+    </w:p>
+    <w:p>
+      <w:r>
+        <w:t>Use the six supplied extracts to identify decision patterns and prepare validation questions. Record the coverage and source date of each material finding.</w:t>
+      </w:r>
+    </w:p>
+    <w:p>
+      <w:pPr>
+        <w:pStyle w:val="Heading2"/>
+      </w:pPr>
+      <w:r>
+        <w:t>Conditional  Ownership and escalation design</w:t>
+      </w:r>
+    </w:p>
+    <w:p>
+      <w:r>
+        <w:t>Validate Northeast decision owners and establish whether Central’s inventory remains current before relying on those records for design.</w:t>
+      </w:r>
+    </w:p>
+    <w:p>
+      <w:pPr>
+        <w:pStyle w:val="Heading2"/>
+      </w:pPr>
+      <w:r>
+        <w:t>Hold  Eight-region diagnostic baseline</w:t>
+      </w:r>
+    </w:p>
+    <w:p>
+      <w:r>
+        <w:t>Do not generalize to West or Southeast until their evidence and regional responses are received. Sofia reviews the residual gaps before Margaret accepts the baseline.</w:t>
       </w:r>
     </w:p>
     <w:p>
@@ -52,7 +95,227 @@
         <w:pStyle w:val="Heading1"/>
       </w:pPr>
       <w:r>
-        <w:t>Evidence and decision implications</w:t>
+        <w:t>Assessment method</w:t>
+      </w:r>
+    </w:p>
+    <w:p>
+      <w:r>
+        <w:rPr>
+          <w:b/>
+        </w:rPr>
+        <w:t xml:space="preserve">Coverage. </w:t>
+      </w:r>
+      <w:r>
+        <w:t>Reconcile the evidence register to all eight regions and the decisions in scope.</w:t>
+      </w:r>
+    </w:p>
+    <w:p>
+      <w:r>
+        <w:rPr>
+          <w:b/>
+        </w:rPr>
+        <w:t xml:space="preserve">Currency. </w:t>
+      </w:r>
+      <w:r>
+        <w:t>Check the source period and ask whether subsequent operating changes invalidate the record.</w:t>
+      </w:r>
+    </w:p>
+    <w:p>
+      <w:r>
+        <w:rPr>
+          <w:b/>
+        </w:rPr>
+        <w:t xml:space="preserve">Completeness. </w:t>
+      </w:r>
+      <w:r>
+        <w:t>Identify missing decision owners, unresolved ownership disputes and absent regional responses.</w:t>
+      </w:r>
+    </w:p>
+    <w:p>
+      <w:r>
+        <w:rPr>
+          <w:b/>
+        </w:rPr>
+        <w:t xml:space="preserve">Traceability. </w:t>
+      </w:r>
+      <w:r>
+        <w:t>Retain the source, date and validation response behind each finding; separate observed ownership from proposed design.</w:t>
+      </w:r>
+    </w:p>
+    <w:p>
+      <w:r>
+        <w:br w:type="page"/>
+      </w:r>
+    </w:p>
+    <w:p>
+      <w:pPr>
+        <w:pStyle w:val="Heading1"/>
+      </w:pPr>
+      <w:r>
+        <w:t>Findings and decision limits</w:t>
+      </w:r>
+    </w:p>
+    <w:p>
+      <w:pPr>
+        <w:pStyle w:val="Heading2"/>
+      </w:pPr>
+      <w:r>
+        <w:t>F01  Regional coverage is incomplete</w:t>
+      </w:r>
+    </w:p>
+    <w:p>
+      <w:r>
+        <w:rPr>
+          <w:i/>
+          <w:sz w:val="18"/>
+        </w:rPr>
+        <w:t>NS-DATA01 · coverage log, reviewed September 7</w:t>
+      </w:r>
+    </w:p>
+    <w:p>
+      <w:r>
+        <w:t>Six of eight regional extracts are received. West and Southeast remain outstanding.</w:t>
+      </w:r>
+    </w:p>
+    <w:p>
+      <w:r>
+        <w:rPr>
+          <w:b/>
+        </w:rPr>
+        <w:t xml:space="preserve">Decision consequence. </w:t>
+      </w:r>
+      <w:r>
+        <w:t>Cross-region findings must state their six-region coverage. The team cannot yet conclude that the ownership pattern applies across Northstar.</w:t>
+      </w:r>
+    </w:p>
+    <w:p>
+      <w:r>
+        <w:rPr>
+          <w:b/>
+        </w:rPr>
+        <w:t xml:space="preserve">Release condition. </w:t>
+      </w:r>
+      <w:r>
+        <w:t>Receive both extracts, record their coverage and dates, and obtain regional responses to the diagnostic questions.</w:t>
+      </w:r>
+    </w:p>
+    <w:p>
+      <w:pPr>
+        <w:pStyle w:val="Heading2"/>
+      </w:pPr>
+      <w:r>
+        <w:t>F02  Northeast ownership requires validation</w:t>
+      </w:r>
+    </w:p>
+    <w:p>
+      <w:r>
+        <w:rPr>
+          <w:i/>
+          <w:sz w:val="18"/>
+        </w:rPr>
+        <w:t>NS-DATA01 · Northeast ownership exceptions</w:t>
+      </w:r>
+    </w:p>
+    <w:p>
+      <w:r>
+        <w:t>The supplied extract has incomplete decision-owner fields. A missing field does not identify who currently holds the decision right.</w:t>
+      </w:r>
+    </w:p>
+    <w:p>
+      <w:r>
+        <w:rPr>
+          <w:b/>
+        </w:rPr>
+        <w:t xml:space="preserve">Decision consequence. </w:t>
+      </w:r>
+      <w:r>
+        <w:t>Do not present proposed owners as observed facts. Decisions that depend on those owners remain conditional until the regional lead validates them.</w:t>
+      </w:r>
+    </w:p>
+    <w:p>
+      <w:r>
+        <w:rPr>
+          <w:b/>
+        </w:rPr>
+        <w:t xml:space="preserve">Release condition. </w:t>
+      </w:r>
+      <w:r>
+        <w:t>Record the observed owner, source and dated regional response; retain any dispute for Sofia’s review.</w:t>
+      </w:r>
+    </w:p>
+    <w:p>
+      <w:pPr>
+        <w:pStyle w:val="Heading2"/>
+      </w:pPr>
+      <w:r>
+        <w:t>F03  Central’s inventory may not reflect current operations</w:t>
+      </w:r>
+    </w:p>
+    <w:p>
+      <w:r>
+        <w:rPr>
+          <w:i/>
+          <w:sz w:val="18"/>
+        </w:rPr>
+        <w:t>NS-DATA01 · Central inventory source-period note</w:t>
+      </w:r>
+    </w:p>
+    <w:p>
+      <w:r>
+        <w:t>Central supplied a prior-quarter inventory. Its age is established; its suitability for the current diagnostic remains unresolved.</w:t>
+      </w:r>
+    </w:p>
+    <w:p>
+      <w:r>
+        <w:rPr>
+          <w:b/>
+        </w:rPr>
+        <w:t xml:space="preserve">Decision consequence. </w:t>
+      </w:r>
+      <w:r>
+        <w:t>Use the inventory to frame questions, with its period visible. Do not treat it as confirmation of current ownership or escalation routes.</w:t>
+      </w:r>
+    </w:p>
+    <w:p>
+      <w:r>
+        <w:rPr>
+          <w:b/>
+        </w:rPr>
+        <w:t xml:space="preserve">Release condition. </w:t>
+      </w:r>
+      <w:r>
+        <w:t>Obtain a current extract or a dated confirmation identifying subsequent changes and confirming which entries remain valid.</w:t>
+      </w:r>
+    </w:p>
+    <w:p>
+      <w:pPr>
+        <w:pStyle w:val="Heading1"/>
+      </w:pPr>
+      <w:r>
+        <w:t>Assessment boundaries</w:t>
+      </w:r>
+    </w:p>
+    <w:p>
+      <w:r>
+        <w:t>Receipt of an extract establishes availability, not validated ownership or readiness. This report does not certify data quality across all fields, conclude that every supplied region is ready for design, or assess implementation readiness. Implementation remains outside the accepted scope.</w:t>
+      </w:r>
+    </w:p>
+    <w:p>
+      <w:r>
+        <w:br w:type="page"/>
+      </w:r>
+    </w:p>
+    <w:p>
+      <w:pPr>
+        <w:pStyle w:val="Heading1"/>
+      </w:pPr>
+      <w:r>
+        <w:t>Actions before the diagnostic baseline</w:t>
+      </w:r>
+    </w:p>
+    <w:p>
+      <w:r>
+        <w:t>Follow-up targets precede the September 11 baseline gate. Northstar owns its evidence; Avery coordinates validation and Sofia reviews the remaining conditions.</w:t>
       </w:r>
     </w:p>
     <w:tbl>
@@ -72,49 +335,46 @@
         </w:trPr>
         <w:tc>
           <w:tcPr>
-            <w:tcW w:type="dxa" w:w="1440"/>
-            <w:shd w:fill="334952"/>
+            <w:tcW w:type="dxa" w:w="5904"/>
+            <w:shd w:fill="EAF0F3"/>
           </w:tcPr>
           <w:p>
             <w:r>
               <w:rPr>
                 <w:b/>
-                <w:color w:val="FFFFFF"/>
-                <w:sz w:val="20"/>
+                <w:sz w:val="18"/>
               </w:rPr>
-              <w:t>Area</w:t>
+              <w:t>Action and completion condition</w:t>
             </w:r>
           </w:p>
         </w:tc>
         <w:tc>
           <w:tcPr>
-            <w:tcW w:type="dxa" w:w="2880"/>
-            <w:shd w:fill="334952"/>
+            <w:tcW w:type="dxa" w:w="2736"/>
+            <w:shd w:fill="EAF0F3"/>
           </w:tcPr>
           <w:p>
             <w:r>
               <w:rPr>
                 <w:b/>
-                <w:color w:val="FFFFFF"/>
-                <w:sz w:val="20"/>
+                <w:sz w:val="18"/>
               </w:rPr>
-              <w:t>Evidence</w:t>
+              <w:t>Accountable owner</w:t>
             </w:r>
           </w:p>
         </w:tc>
         <w:tc>
           <w:tcPr>
-            <w:tcW w:type="dxa" w:w="5760"/>
-            <w:shd w:fill="334952"/>
+            <w:tcW w:type="dxa" w:w="1440"/>
+            <w:shd w:fill="EAF0F3"/>
           </w:tcPr>
           <w:p>
             <w:r>
               <w:rPr>
                 <w:b/>
-                <w:color w:val="FFFFFF"/>
-                <w:sz w:val="20"/>
+                <w:sz w:val="18"/>
               </w:rPr>
-              <w:t>Decision implication</w:t>
+              <w:t>Target</w:t>
             </w:r>
           </w:p>
         </w:tc>
@@ -125,73 +385,74 @@
         </w:trPr>
         <w:tc>
           <w:tcPr>
-            <w:tcW w:type="dxa" w:w="1440"/>
+            <w:tcW w:type="dxa" w:w="5904"/>
             <w:vAlign w:val="center"/>
-            <w:shd w:fill="F0F3F5"/>
             <w:tcMar>
-              <w:top w:w="110" w:type="dxa"/>
-              <w:bottom w:w="110" w:type="dxa"/>
-              <w:start w:w="110" w:type="dxa"/>
-              <w:end w:w="110" w:type="dxa"/>
+              <w:top w:w="90" w:type="dxa"/>
+              <w:bottom w:w="90" w:type="dxa"/>
+              <w:start w:w="90" w:type="dxa"/>
+              <w:end w:w="90" w:type="dxa"/>
             </w:tcMar>
           </w:tcPr>
           <w:p>
             <w:pPr>
-              <w:spacing w:after="40" w:line="269" w:lineRule="auto"/>
+              <w:spacing w:after="60"/>
             </w:pPr>
             <w:r>
               <w:rPr>
                 <w:sz w:val="20"/>
               </w:rPr>
-              <w:t>Coverage</w:t>
+              <w:t>A01  Obtain West and Southeast evidence and regional responses</w:t>
+              <w:br/>
+              <w:t>F01. Both extracts are registered with source dates, coverage and responses to the diagnostic questions.</w:t>
             </w:r>
           </w:p>
         </w:tc>
         <w:tc>
           <w:tcPr>
-            <w:tcW w:type="dxa" w:w="2880"/>
+            <w:tcW w:type="dxa" w:w="2736"/>
             <w:vAlign w:val="center"/>
-            <w:shd w:fill="F0F3F5"/>
             <w:tcMar>
-              <w:top w:w="110" w:type="dxa"/>
-              <w:bottom w:w="110" w:type="dxa"/>
-              <w:start w:w="110" w:type="dxa"/>
-              <w:end w:w="110" w:type="dxa"/>
+              <w:top w:w="90" w:type="dxa"/>
+              <w:bottom w:w="90" w:type="dxa"/>
+              <w:start w:w="90" w:type="dxa"/>
+              <w:end w:w="90" w:type="dxa"/>
             </w:tcMar>
           </w:tcPr>
           <w:p>
             <w:pPr>
-              <w:spacing w:after="40" w:line="269" w:lineRule="auto"/>
+              <w:spacing w:after="60"/>
             </w:pPr>
             <w:r>
               <w:rPr>
                 <w:sz w:val="20"/>
               </w:rPr>
-              <w:t>6 of 8 regional extracts. West and Southeast outstanding.</w:t>
+              <w:t>Northstar regional leads</w:t>
+              <w:br/>
+              <w:t>Coordinate: Avery Ross</w:t>
             </w:r>
           </w:p>
         </w:tc>
         <w:tc>
           <w:tcPr>
-            <w:tcW w:type="dxa" w:w="5760"/>
+            <w:tcW w:type="dxa" w:w="1440"/>
             <w:vAlign w:val="center"/>
-            <w:shd w:fill="F0F3F5"/>
             <w:tcMar>
-              <w:top w:w="110" w:type="dxa"/>
-              <w:bottom w:w="110" w:type="dxa"/>
-              <w:start w:w="110" w:type="dxa"/>
-              <w:end w:w="110" w:type="dxa"/>
+              <w:top w:w="90" w:type="dxa"/>
+              <w:bottom w:w="90" w:type="dxa"/>
+              <w:start w:w="90" w:type="dxa"/>
+              <w:end w:w="90" w:type="dxa"/>
             </w:tcMar>
           </w:tcPr>
           <w:p>
             <w:pPr>
-              <w:spacing w:after="40" w:line="269" w:lineRule="auto"/>
+              <w:spacing w:after="60"/>
             </w:pPr>
             <w:r>
               <w:rPr>
                 <w:sz w:val="20"/>
               </w:rPr>
-              <w:t>The current evidence cannot establish a complete view of decision ownership across all eight regions.</w:t>
+              <w:t>September 9</w:t>
             </w:r>
           </w:p>
         </w:tc>
@@ -202,73 +463,74 @@
         </w:trPr>
         <w:tc>
           <w:tcPr>
-            <w:tcW w:type="dxa" w:w="1440"/>
+            <w:tcW w:type="dxa" w:w="5904"/>
             <w:vAlign w:val="center"/>
-            <w:shd w:fill="FFFFFF"/>
             <w:tcMar>
-              <w:top w:w="110" w:type="dxa"/>
-              <w:bottom w:w="110" w:type="dxa"/>
-              <w:start w:w="110" w:type="dxa"/>
-              <w:end w:w="110" w:type="dxa"/>
+              <w:top w:w="90" w:type="dxa"/>
+              <w:bottom w:w="90" w:type="dxa"/>
+              <w:start w:w="90" w:type="dxa"/>
+              <w:end w:w="90" w:type="dxa"/>
             </w:tcMar>
           </w:tcPr>
           <w:p>
             <w:pPr>
-              <w:spacing w:after="40" w:line="269" w:lineRule="auto"/>
+              <w:spacing w:after="60"/>
             </w:pPr>
             <w:r>
               <w:rPr>
                 <w:sz w:val="20"/>
               </w:rPr>
-              <w:t>Ownership</w:t>
+              <w:t>A02  Validate Northeast’s missing decision owners</w:t>
+              <w:br/>
+              <w:t>F02. Observed owners and their supporting records are confirmed; disputes remain identified separately.</w:t>
             </w:r>
           </w:p>
         </w:tc>
         <w:tc>
           <w:tcPr>
-            <w:tcW w:type="dxa" w:w="2880"/>
+            <w:tcW w:type="dxa" w:w="2736"/>
             <w:vAlign w:val="center"/>
-            <w:shd w:fill="FFFFFF"/>
             <w:tcMar>
-              <w:top w:w="110" w:type="dxa"/>
-              <w:bottom w:w="110" w:type="dxa"/>
-              <w:start w:w="110" w:type="dxa"/>
-              <w:end w:w="110" w:type="dxa"/>
+              <w:top w:w="90" w:type="dxa"/>
+              <w:bottom w:w="90" w:type="dxa"/>
+              <w:start w:w="90" w:type="dxa"/>
+              <w:end w:w="90" w:type="dxa"/>
             </w:tcMar>
           </w:tcPr>
           <w:p>
             <w:pPr>
-              <w:spacing w:after="40" w:line="269" w:lineRule="auto"/>
+              <w:spacing w:after="60"/>
             </w:pPr>
             <w:r>
               <w:rPr>
                 <w:sz w:val="20"/>
               </w:rPr>
-              <w:t>Northeast incomplete. Affected decision owners need validation.</w:t>
+              <w:t>Northeast regional lead</w:t>
+              <w:br/>
+              <w:t>Coordinate: Avery Ross</w:t>
             </w:r>
           </w:p>
         </w:tc>
         <w:tc>
           <w:tcPr>
-            <w:tcW w:type="dxa" w:w="5760"/>
+            <w:tcW w:type="dxa" w:w="1440"/>
             <w:vAlign w:val="center"/>
-            <w:shd w:fill="FFFFFF"/>
             <w:tcMar>
-              <w:top w:w="110" w:type="dxa"/>
-              <w:bottom w:w="110" w:type="dxa"/>
-              <w:start w:w="110" w:type="dxa"/>
-              <w:end w:w="110" w:type="dxa"/>
+              <w:top w:w="90" w:type="dxa"/>
+              <w:bottom w:w="90" w:type="dxa"/>
+              <w:start w:w="90" w:type="dxa"/>
+              <w:end w:w="90" w:type="dxa"/>
             </w:tcMar>
           </w:tcPr>
           <w:p>
             <w:pPr>
-              <w:spacing w:after="40" w:line="269" w:lineRule="auto"/>
+              <w:spacing w:after="60"/>
             </w:pPr>
             <w:r>
               <w:rPr>
                 <w:sz w:val="20"/>
               </w:rPr>
-              <w:t>Decisions involving disputed or missing owners require regional confirmation before the design baseline.</w:t>
+              <w:t>September 9</w:t>
             </w:r>
           </w:p>
         </w:tc>
@@ -279,178 +541,157 @@
         </w:trPr>
         <w:tc>
           <w:tcPr>
-            <w:tcW w:type="dxa" w:w="1440"/>
+            <w:tcW w:type="dxa" w:w="5904"/>
             <w:vAlign w:val="center"/>
-            <w:shd w:fill="F0F3F5"/>
             <w:tcMar>
-              <w:top w:w="110" w:type="dxa"/>
-              <w:bottom w:w="110" w:type="dxa"/>
-              <w:start w:w="110" w:type="dxa"/>
-              <w:end w:w="110" w:type="dxa"/>
+              <w:top w:w="90" w:type="dxa"/>
+              <w:bottom w:w="90" w:type="dxa"/>
+              <w:start w:w="90" w:type="dxa"/>
+              <w:end w:w="90" w:type="dxa"/>
             </w:tcMar>
           </w:tcPr>
           <w:p>
             <w:pPr>
-              <w:spacing w:after="40" w:line="269" w:lineRule="auto"/>
+              <w:spacing w:after="60"/>
             </w:pPr>
             <w:r>
               <w:rPr>
                 <w:sz w:val="20"/>
               </w:rPr>
-              <w:t>Currency</w:t>
+              <w:t>A03  Confirm Central’s inventory or replace it</w:t>
+              <w:br/>
+              <w:t>F03. A current extract or dated confirmation explains which entries remain valid and what changed.</w:t>
             </w:r>
           </w:p>
         </w:tc>
         <w:tc>
           <w:tcPr>
-            <w:tcW w:type="dxa" w:w="2880"/>
+            <w:tcW w:type="dxa" w:w="2736"/>
             <w:vAlign w:val="center"/>
-            <w:shd w:fill="F0F3F5"/>
             <w:tcMar>
-              <w:top w:w="110" w:type="dxa"/>
-              <w:bottom w:w="110" w:type="dxa"/>
-              <w:start w:w="110" w:type="dxa"/>
-              <w:end w:w="110" w:type="dxa"/>
+              <w:top w:w="90" w:type="dxa"/>
+              <w:bottom w:w="90" w:type="dxa"/>
+              <w:start w:w="90" w:type="dxa"/>
+              <w:end w:w="90" w:type="dxa"/>
             </w:tcMar>
           </w:tcPr>
           <w:p>
             <w:pPr>
-              <w:spacing w:after="40" w:line="269" w:lineRule="auto"/>
+              <w:spacing w:after="60"/>
             </w:pPr>
             <w:r>
               <w:rPr>
                 <w:sz w:val="20"/>
               </w:rPr>
-              <w:t>Central: prior quarter. Confirm suitability for current decisions.</w:t>
+              <w:t>Central regional lead</w:t>
+              <w:br/>
+              <w:t>Coordinate: Avery Ross</w:t>
             </w:r>
           </w:p>
         </w:tc>
         <w:tc>
           <w:tcPr>
-            <w:tcW w:type="dxa" w:w="5760"/>
+            <w:tcW w:type="dxa" w:w="1440"/>
             <w:vAlign w:val="center"/>
-            <w:shd w:fill="F0F3F5"/>
             <w:tcMar>
-              <w:top w:w="110" w:type="dxa"/>
-              <w:bottom w:w="110" w:type="dxa"/>
-              <w:start w:w="110" w:type="dxa"/>
-              <w:end w:w="110" w:type="dxa"/>
+              <w:top w:w="90" w:type="dxa"/>
+              <w:bottom w:w="90" w:type="dxa"/>
+              <w:start w:w="90" w:type="dxa"/>
+              <w:end w:w="90" w:type="dxa"/>
             </w:tcMar>
           </w:tcPr>
           <w:p>
             <w:pPr>
-              <w:spacing w:after="40" w:line="269" w:lineRule="auto"/>
+              <w:spacing w:after="60"/>
             </w:pPr>
             <w:r>
               <w:rPr>
                 <w:sz w:val="20"/>
               </w:rPr>
-              <w:t>The team must validate whether the inventory still represents the current operating environment.</w:t>
+              <w:t>September 9</w:t>
+            </w:r>
+          </w:p>
+        </w:tc>
+      </w:tr>
+      <w:tr>
+        <w:trPr>
+          <w:cantSplit/>
+        </w:trPr>
+        <w:tc>
+          <w:tcPr>
+            <w:tcW w:type="dxa" w:w="5904"/>
+            <w:vAlign w:val="center"/>
+            <w:tcMar>
+              <w:top w:w="90" w:type="dxa"/>
+              <w:bottom w:w="90" w:type="dxa"/>
+              <w:start w:w="90" w:type="dxa"/>
+              <w:end w:w="90" w:type="dxa"/>
+            </w:tcMar>
+          </w:tcPr>
+          <w:p>
+            <w:pPr>
+              <w:spacing w:after="60"/>
+            </w:pPr>
+            <w:r>
+              <w:rPr>
+                <w:sz w:val="20"/>
+              </w:rPr>
+              <w:t>A04  Review the evidence exceptions before the baseline gate</w:t>
+              <w:br/>
+              <w:t>F01–F03. The diagnostic baseline records resolved gaps, remaining conditions and Margaret’s acceptance decision.</w:t>
+            </w:r>
+          </w:p>
+        </w:tc>
+        <w:tc>
+          <w:tcPr>
+            <w:tcW w:type="dxa" w:w="2736"/>
+            <w:vAlign w:val="center"/>
+            <w:tcMar>
+              <w:top w:w="90" w:type="dxa"/>
+              <w:bottom w:w="90" w:type="dxa"/>
+              <w:start w:w="90" w:type="dxa"/>
+              <w:end w:w="90" w:type="dxa"/>
+            </w:tcMar>
+          </w:tcPr>
+          <w:p>
+            <w:pPr>
+              <w:spacing w:after="60"/>
+            </w:pPr>
+            <w:r>
+              <w:rPr>
+                <w:sz w:val="20"/>
+              </w:rPr>
+              <w:t>Sofia Patel</w:t>
+              <w:br/>
+              <w:t>Coordinate: Margaret Whitfield</w:t>
+            </w:r>
+          </w:p>
+        </w:tc>
+        <w:tc>
+          <w:tcPr>
+            <w:tcW w:type="dxa" w:w="1440"/>
+            <w:vAlign w:val="center"/>
+            <w:tcMar>
+              <w:top w:w="90" w:type="dxa"/>
+              <w:bottom w:w="90" w:type="dxa"/>
+              <w:start w:w="90" w:type="dxa"/>
+              <w:end w:w="90" w:type="dxa"/>
+            </w:tcMar>
+          </w:tcPr>
+          <w:p>
+            <w:pPr>
+              <w:spacing w:after="60"/>
+            </w:pPr>
+            <w:r>
+              <w:rPr>
+                <w:sz w:val="20"/>
+              </w:rPr>
+              <w:t>September 11</w:t>
             </w:r>
           </w:p>
         </w:tc>
       </w:tr>
     </w:tbl>
-    <w:p>
-      <w:r>
-        <w:br w:type="page"/>
-      </w:r>
-    </w:p>
-    <w:p>
-      <w:pPr>
-        <w:pStyle w:val="Heading1"/>
-      </w:pPr>
-      <w:r>
-        <w:t>Actions before the design baseline</w:t>
-      </w:r>
-    </w:p>
-    <w:p>
-      <w:r>
-        <w:t>Resolve the following evidence gaps before confirming design decisions that depend on them. Initial diagnostic work can proceed for the six supplied regions.</w:t>
-      </w:r>
-    </w:p>
-    <w:p>
-      <w:pPr>
-        <w:pStyle w:val="ListNumber"/>
-      </w:pPr>
-      <w:r>
-        <w:t>Obtain the West and Southeast extracts and record their source dates and coverage in the evidence register.</w:t>
-      </w:r>
-    </w:p>
-    <w:p>
-      <w:pPr>
-        <w:pStyle w:val="ListNumber"/>
-      </w:pPr>
-      <w:r>
-        <w:t>Validate Northeast decision owners with the relevant regional leads and retain unresolved ownership disputes.</w:t>
-      </w:r>
-    </w:p>
-    <w:p>
-      <w:pPr>
-        <w:pStyle w:val="ListNumber"/>
-      </w:pPr>
-      <w:r>
-        <w:t>Confirm the suitability of Central's prior-quarter inventory before relying on it for design decisions.</w:t>
-      </w:r>
-    </w:p>
-    <w:p>
-      <w:pPr>
-        <w:pStyle w:val="ListNumber"/>
-      </w:pPr>
-      <w:r>
-        <w:t>Review the resolved evidence gaps with the design lead before confirming the diagnostic baseline.</w:t>
-      </w:r>
-    </w:p>
-    <w:p>
-      <w:pPr>
-        <w:pStyle w:val="Heading1"/>
-      </w:pPr>
-      <w:r>
-        <w:t>Scope and decision boundary</w:t>
-      </w:r>
-    </w:p>
-    <w:p>
-      <w:r>
-        <w:t>This assessment supports the agreed operating-model diagnostic. Receipt of a regional extract does not establish its suitability for design decisions. Proposed ownership must remain separate from observed ownership, and unresolved questions must remain visible until validated.</w:t>
-      </w:r>
-    </w:p>
-    <w:p>
-      <w:r>
-        <w:t>Implementation remains outside the accepted engagement scope. The diagnostic baseline should reflect the evidence validated by the regional leads and reviewed by the design lead.</w:t>
-      </w:r>
-    </w:p>
-    <w:p>
-      <w:pPr>
-        <w:pStyle w:val="Heading1"/>
-      </w:pPr>
-      <w:r>
-        <w:t>Supporting records</w:t>
-      </w:r>
-    </w:p>
-    <w:p>
-      <w:pPr>
-        <w:pStyle w:val="ListBullet"/>
-      </w:pPr>
-      <w:r>
-        <w:t>NS DATA01 regional evidence register</w:t>
-      </w:r>
-    </w:p>
-    <w:p>
-      <w:pPr>
-        <w:pStyle w:val="ListBullet"/>
-      </w:pPr>
-      <w:r>
-        <w:t>Approved engagement plan v1</w:t>
-      </w:r>
-    </w:p>
-    <w:p>
-      <w:pPr>
-        <w:pStyle w:val="ListBullet"/>
-      </w:pPr>
-      <w:r>
-        <w:t>Firm data readiness assessment template ASG DR01 v1.2</w:t>
-      </w:r>
-    </w:p>
     <w:p>
       <w:pPr>
         <w:pStyle w:val="Heading1"/>
@@ -461,14 +702,82 @@
     </w:p>
     <w:p>
       <w:r>
-        <w:t>Revision 2 clarifies what the coverage, ownership and currency gaps prevent the team from concluding about design readiness. Sofia Patel approved the revised assessment for export after reviewing that clarification.</w:t>
+        <w:t>Sofia’s review of revision 1 challenged the jump from evidence received to design readiness. Revision 2 makes each finding’s decision consequence and release condition explicit, assigns follow-up owners and dates, and prevents a six-region diagnostic from being presented as an eight-region conclusion. Approval of the report does not close the client’s outstanding evidence actions.</w:t>
+      </w:r>
+    </w:p>
+    <w:p>
+      <w:pPr>
+        <w:pStyle w:val="Heading1"/>
+      </w:pPr>
+      <w:r>
+        <w:t>Source register</w:t>
+      </w:r>
+    </w:p>
+    <w:p>
+      <w:r>
+        <w:rPr>
+          <w:b/>
+          <w:sz w:val="20"/>
+        </w:rPr>
+        <w:t xml:space="preserve">S01  NS-DATA01 · Regional evidence register. </w:t>
+      </w:r>
+      <w:r>
+        <w:rPr>
+          <w:sz w:val="20"/>
+        </w:rPr>
+        <w:t>Northstar evidence: receipt status, ownership exceptions and source periods. Reviewed September 7, 2026.</w:t>
+      </w:r>
+    </w:p>
+    <w:p>
+      <w:r>
+        <w:rPr>
+          <w:b/>
+          <w:sz w:val="20"/>
+        </w:rPr>
+        <w:t xml:space="preserve">S02  Approved engagement plan v1 · NS-D01 / G1. </w:t>
+      </w:r>
+      <w:r>
+        <w:rPr>
+          <w:sz w:val="20"/>
+        </w:rPr>
+        <w:t>Assignment: Avery, 36 hours, September 7; Sofia reviews before the September 11 diagnostic baseline.</w:t>
+      </w:r>
+    </w:p>
+    <w:p>
+      <w:r>
+        <w:rPr>
+          <w:b/>
+          <w:sz w:val="20"/>
+        </w:rPr>
+        <w:t xml:space="preserve">S03  Data Readiness Assessment · Practice library. </w:t>
+      </w:r>
+      <w:r>
+        <w:rPr>
+          <w:sz w:val="20"/>
+        </w:rPr>
+        <w:t>Firm method: coverage, currency, completeness, traceability and the report structure.</w:t>
+      </w:r>
+    </w:p>
+    <w:p>
+      <w:r>
+        <w:rPr>
+          <w:b/>
+          <w:sz w:val="20"/>
+        </w:rPr>
+        <w:t xml:space="preserve">S04  Evidence review guidance · Shared by Sofia. </w:t>
+      </w:r>
+      <w:r>
+        <w:rPr>
+          <w:sz w:val="20"/>
+        </w:rPr>
+        <w:t>Approved guidance on observed versus proposed ownership, source dates and unresolved conflicts. Informs the method; does not establish facts about Northstar.</w:t>
       </w:r>
     </w:p>
     <w:sectPr>
       <w:headerReference w:type="default" r:id="rId9"/>
       <w:footerReference w:type="default" r:id="rId10"/>
       <w:pgSz w:w="12240" w:h="15840"/>
-      <w:pgMar w:top="1224" w:right="1080" w:bottom="1008" w:left="1080" w:header="432" w:footer="432" w:gutter="0"/>
+      <w:pgMar w:top="1080" w:right="1080" w:bottom="1008" w:left="1080" w:header="432" w:footer="432" w:gutter="0"/>
       <w:cols w:space="720"/>
       <w:docGrid w:linePitch="360"/>
     </w:sectPr>
@@ -487,7 +796,7 @@
       <w:rPr>
         <w:sz w:val="16"/>
       </w:rPr>
-      <w:t xml:space="preserve">Northstar Foods  |  Assessment  |  </w:t>
+      <w:t xml:space="preserve">Northstar Foods  |  Confidential  |  September 7, 2026  |  </w:t>
     </w:r>
     <w:fldSimple w:instr="PAGE"/>
   </w:p>
@@ -499,12 +808,11 @@
   <w:p>
     <w:pPr>
       <w:pStyle w:val="Header"/>
-      <w:spacing w:after="0"/>
     </w:pPr>
     <w:r>
       <w:drawing>
         <wp:inline xmlns:a="http://schemas.openxmlformats.org/drawingml/2006/main" xmlns:pic="http://schemas.openxmlformats.org/drawingml/2006/picture">
-          <wp:extent cx="274320" cy="274320"/>
+          <wp:extent cx="246888" cy="246888"/>
           <wp:docPr id="1" name="Picture 1"/>
           <wp:cNvGraphicFramePr>
             <a:graphicFrameLocks noChangeAspect="1"/>
@@ -525,7 +833,7 @@
                 <pic:spPr>
                   <a:xfrm>
                     <a:off x="0" y="0"/>
-                    <a:ext cx="274320" cy="274320"/>
+                    <a:ext cx="246888" cy="246888"/>
                   </a:xfrm>
                   <a:prstGeom prst="rect"/>
                 </pic:spPr>
@@ -909,7 +1217,7 @@
     <w:qFormat/>
     <w:rsid w:val="00FC693F"/>
     <w:pPr>
-      <w:spacing w:line="274" w:lineRule="auto" w:after="160"/>
+      <w:spacing w:line="250" w:lineRule="auto" w:after="120"/>
     </w:pPr>
     <w:rPr>
       <w:rFonts w:ascii="Calibri" w:hAnsi="Calibri"/>
@@ -972,7 +1280,7 @@
     <w:pPr>
       <w:keepNext/>
       <w:keepLines/>
-      <w:spacing w:before="320" w:after="140"/>
+      <w:spacing w:before="240" w:after="100"/>
       <w:outlineLvl w:val="0"/>
     </w:pPr>
     <w:rPr>
@@ -980,7 +1288,7 @@
       <w:b/>
       <w:bCs/>
       <w:color w:val="000000"/>
-      <w:sz w:val="30"/>
+      <w:sz w:val="28"/>
       <w:szCs w:val="28"/>
     </w:rPr>
   </w:style>
@@ -996,7 +1304,7 @@
     <w:pPr>
       <w:keepNext/>
       <w:keepLines/>
-      <w:spacing w:before="320" w:after="140"/>
+      <w:spacing w:before="240" w:after="100"/>
       <w:outlineLvl w:val="1"/>
     </w:pPr>
     <w:rPr>
@@ -1004,7 +1312,7 @@
       <w:b/>
       <w:bCs/>
       <w:color w:val="000000"/>
-      <w:sz w:val="24"/>
+      <w:sz w:val="22"/>
       <w:szCs w:val="26"/>
     </w:rPr>
   </w:style>
@@ -1261,7 +1569,7 @@
       <w:pBdr>
         <w:bottom w:val="single" w:sz="8" w:space="4" w:color="4F81BD" w:themeColor="accent1"/>
       </w:pBdr>
-      <w:spacing w:after="180" w:line="240" w:lineRule="auto"/>
+      <w:spacing w:after="120" w:line="240" w:lineRule="auto"/>
       <w:contextualSpacing/>
     </w:pPr>
     <w:rPr>
@@ -1269,7 +1577,7 @@
       <w:color w:val="000000"/>
       <w:spacing w:val="5"/>
       <w:kern w:val="28"/>
-      <w:sz w:val="60"/>
+      <w:sz w:val="58"/>
       <w:szCs w:val="52"/>
     </w:rPr>
   </w:style>
@@ -1307,7 +1615,7 @@
       <w:iCs/>
       <w:color w:val="000000"/>
       <w:spacing w:val="15"/>
-      <w:sz w:val="24"/>
+      <w:sz w:val="26"/>
       <w:szCs w:val="24"/>
     </w:rPr>
   </w:style>

</xml_diff>

<commit_message>
Show consultant judgment and shorten demo outputs
</commit_message>
<xml_diff>
--- a/ao-vite/public/demo/northstar-data-readiness-assessment.docx
+++ b/ao-vite/public/demo/northstar-data-readiness-assessment.docx
@@ -16,8 +16,6 @@
       </w:pPr>
       <w:r>
         <w:t>Northstar Foods</w:t>
-        <w:br/>
-        <w:t>Decision rights and operating model</w:t>
       </w:r>
     </w:p>
     <w:p>
@@ -35,59 +33,12 @@
         <w:pStyle w:val="Heading1"/>
       </w:pPr>
       <w:r>
-        <w:t>Executive assessment</w:t>
+        <w:t>Recommendation</w:t>
       </w:r>
     </w:p>
     <w:p>
       <w:r>
-        <w:rPr>
-          <w:b/>
-        </w:rPr>
-        <w:t>Proceed with diagnosis; hold the affected design decisions.</w:t>
-      </w:r>
-    </w:p>
-    <w:p>
-      <w:r>
-        <w:t>The evidence supports a bounded diagnostic, not an eight-region design-readiness conclusion. Six regional extracts have been received. Two absent extracts, incomplete Northeast ownership fields and Central’s older inventory leave material questions about who makes decisions today. These gaps affect the completeness and reliability of the diagnostic baseline; they are not evidence that the proposed operating model is wrong.</w:t>
-      </w:r>
-    </w:p>
-    <w:p>
-      <w:pPr>
-        <w:pStyle w:val="Heading2"/>
-      </w:pPr>
-      <w:r>
-        <w:t>Proceed  Initial diagnostic work</w:t>
-      </w:r>
-    </w:p>
-    <w:p>
-      <w:r>
-        <w:t>Use the six supplied extracts to identify decision patterns and prepare validation questions. Record the coverage and source date of each material finding.</w:t>
-      </w:r>
-    </w:p>
-    <w:p>
-      <w:pPr>
-        <w:pStyle w:val="Heading2"/>
-      </w:pPr>
-      <w:r>
-        <w:t>Conditional  Ownership and escalation design</w:t>
-      </w:r>
-    </w:p>
-    <w:p>
-      <w:r>
-        <w:t>Validate Northeast decision owners and establish whether Central’s inventory remains current before relying on those records for design.</w:t>
-      </w:r>
-    </w:p>
-    <w:p>
-      <w:pPr>
-        <w:pStyle w:val="Heading2"/>
-      </w:pPr>
-      <w:r>
-        <w:t>Hold  Eight-region diagnostic baseline</w:t>
-      </w:r>
-    </w:p>
-    <w:p>
-      <w:r>
-        <w:t>Do not generalize to West or Southeast until their evidence and regional responses are received. Sofia reviews the residual gaps before Margaret accepts the baseline.</w:t>
+        <w:t>Proceed with diagnosis in the six supplied regions. Hold Northeast ownership assignments and cross-region escalation routes until the evidence gaps are resolved.</w:t>
       </w:r>
     </w:p>
     <w:p>
@@ -95,227 +46,7 @@
         <w:pStyle w:val="Heading1"/>
       </w:pPr>
       <w:r>
-        <w:t>Assessment method</w:t>
-      </w:r>
-    </w:p>
-    <w:p>
-      <w:r>
-        <w:rPr>
-          <w:b/>
-        </w:rPr>
-        <w:t xml:space="preserve">Coverage. </w:t>
-      </w:r>
-      <w:r>
-        <w:t>Reconcile the evidence register to all eight regions and the decisions in scope.</w:t>
-      </w:r>
-    </w:p>
-    <w:p>
-      <w:r>
-        <w:rPr>
-          <w:b/>
-        </w:rPr>
-        <w:t xml:space="preserve">Currency. </w:t>
-      </w:r>
-      <w:r>
-        <w:t>Check the source period and ask whether subsequent operating changes invalidate the record.</w:t>
-      </w:r>
-    </w:p>
-    <w:p>
-      <w:r>
-        <w:rPr>
-          <w:b/>
-        </w:rPr>
-        <w:t xml:space="preserve">Completeness. </w:t>
-      </w:r>
-      <w:r>
-        <w:t>Identify missing decision owners, unresolved ownership disputes and absent regional responses.</w:t>
-      </w:r>
-    </w:p>
-    <w:p>
-      <w:r>
-        <w:rPr>
-          <w:b/>
-        </w:rPr>
-        <w:t xml:space="preserve">Traceability. </w:t>
-      </w:r>
-      <w:r>
-        <w:t>Retain the source, date and validation response behind each finding; separate observed ownership from proposed design.</w:t>
-      </w:r>
-    </w:p>
-    <w:p>
-      <w:r>
-        <w:br w:type="page"/>
-      </w:r>
-    </w:p>
-    <w:p>
-      <w:pPr>
-        <w:pStyle w:val="Heading1"/>
-      </w:pPr>
-      <w:r>
-        <w:t>Findings and decision limits</w:t>
-      </w:r>
-    </w:p>
-    <w:p>
-      <w:pPr>
-        <w:pStyle w:val="Heading2"/>
-      </w:pPr>
-      <w:r>
-        <w:t>F01  Regional coverage is incomplete</w:t>
-      </w:r>
-    </w:p>
-    <w:p>
-      <w:r>
-        <w:rPr>
-          <w:i/>
-          <w:sz w:val="18"/>
-        </w:rPr>
-        <w:t>NS-DATA01 · coverage log, reviewed September 7</w:t>
-      </w:r>
-    </w:p>
-    <w:p>
-      <w:r>
-        <w:t>Six of eight regional extracts are received. West and Southeast remain outstanding.</w:t>
-      </w:r>
-    </w:p>
-    <w:p>
-      <w:r>
-        <w:rPr>
-          <w:b/>
-        </w:rPr>
-        <w:t xml:space="preserve">Decision consequence. </w:t>
-      </w:r>
-      <w:r>
-        <w:t>Cross-region findings must state their six-region coverage. The team cannot yet conclude that the ownership pattern applies across Northstar.</w:t>
-      </w:r>
-    </w:p>
-    <w:p>
-      <w:r>
-        <w:rPr>
-          <w:b/>
-        </w:rPr>
-        <w:t xml:space="preserve">Release condition. </w:t>
-      </w:r>
-      <w:r>
-        <w:t>Receive both extracts, record their coverage and dates, and obtain regional responses to the diagnostic questions.</w:t>
-      </w:r>
-    </w:p>
-    <w:p>
-      <w:pPr>
-        <w:pStyle w:val="Heading2"/>
-      </w:pPr>
-      <w:r>
-        <w:t>F02  Northeast ownership requires validation</w:t>
-      </w:r>
-    </w:p>
-    <w:p>
-      <w:r>
-        <w:rPr>
-          <w:i/>
-          <w:sz w:val="18"/>
-        </w:rPr>
-        <w:t>NS-DATA01 · Northeast ownership exceptions</w:t>
-      </w:r>
-    </w:p>
-    <w:p>
-      <w:r>
-        <w:t>The supplied extract has incomplete decision-owner fields. A missing field does not identify who currently holds the decision right.</w:t>
-      </w:r>
-    </w:p>
-    <w:p>
-      <w:r>
-        <w:rPr>
-          <w:b/>
-        </w:rPr>
-        <w:t xml:space="preserve">Decision consequence. </w:t>
-      </w:r>
-      <w:r>
-        <w:t>Do not present proposed owners as observed facts. Decisions that depend on those owners remain conditional until the regional lead validates them.</w:t>
-      </w:r>
-    </w:p>
-    <w:p>
-      <w:r>
-        <w:rPr>
-          <w:b/>
-        </w:rPr>
-        <w:t xml:space="preserve">Release condition. </w:t>
-      </w:r>
-      <w:r>
-        <w:t>Record the observed owner, source and dated regional response; retain any dispute for Sofia’s review.</w:t>
-      </w:r>
-    </w:p>
-    <w:p>
-      <w:pPr>
-        <w:pStyle w:val="Heading2"/>
-      </w:pPr>
-      <w:r>
-        <w:t>F03  Central’s inventory may not reflect current operations</w:t>
-      </w:r>
-    </w:p>
-    <w:p>
-      <w:r>
-        <w:rPr>
-          <w:i/>
-          <w:sz w:val="18"/>
-        </w:rPr>
-        <w:t>NS-DATA01 · Central inventory source-period note</w:t>
-      </w:r>
-    </w:p>
-    <w:p>
-      <w:r>
-        <w:t>Central supplied a prior-quarter inventory. Its age is established; its suitability for the current diagnostic remains unresolved.</w:t>
-      </w:r>
-    </w:p>
-    <w:p>
-      <w:r>
-        <w:rPr>
-          <w:b/>
-        </w:rPr>
-        <w:t xml:space="preserve">Decision consequence. </w:t>
-      </w:r>
-      <w:r>
-        <w:t>Use the inventory to frame questions, with its period visible. Do not treat it as confirmation of current ownership or escalation routes.</w:t>
-      </w:r>
-    </w:p>
-    <w:p>
-      <w:r>
-        <w:rPr>
-          <w:b/>
-        </w:rPr>
-        <w:t xml:space="preserve">Release condition. </w:t>
-      </w:r>
-      <w:r>
-        <w:t>Obtain a current extract or a dated confirmation identifying subsequent changes and confirming which entries remain valid.</w:t>
-      </w:r>
-    </w:p>
-    <w:p>
-      <w:pPr>
-        <w:pStyle w:val="Heading1"/>
-      </w:pPr>
-      <w:r>
-        <w:t>Assessment boundaries</w:t>
-      </w:r>
-    </w:p>
-    <w:p>
-      <w:r>
-        <w:t>Receipt of an extract establishes availability, not validated ownership or readiness. This report does not certify data quality across all fields, conclude that every supplied region is ready for design, or assess implementation readiness. Implementation remains outside the accepted scope.</w:t>
-      </w:r>
-    </w:p>
-    <w:p>
-      <w:r>
-        <w:br w:type="page"/>
-      </w:r>
-    </w:p>
-    <w:p>
-      <w:pPr>
-        <w:pStyle w:val="Heading1"/>
-      </w:pPr>
-      <w:r>
-        <w:t>Actions before the diagnostic baseline</w:t>
-      </w:r>
-    </w:p>
-    <w:p>
-      <w:r>
-        <w:t>Follow-up targets precede the September 11 baseline gate. Northstar owns its evidence; Avery coordinates validation and Sofia reviews the remaining conditions.</w:t>
+        <w:t>Evidence and follow up</w:t>
       </w:r>
     </w:p>
     <w:tbl>
@@ -325,44 +56,13 @@
         <w:tblLook w:firstColumn="1" w:firstRow="1" w:lastColumn="0" w:lastRow="0" w:noHBand="0" w:noVBand="1" w:val="04A0"/>
       </w:tblPr>
       <w:tblGrid>
-        <w:gridCol w:w="3360"/>
-        <w:gridCol w:w="3360"/>
-        <w:gridCol w:w="3360"/>
+        <w:gridCol w:w="5040"/>
+        <w:gridCol w:w="5040"/>
       </w:tblGrid>
       <w:tr>
         <w:trPr>
           <w:tblHeader/>
         </w:trPr>
-        <w:tc>
-          <w:tcPr>
-            <w:tcW w:type="dxa" w:w="5904"/>
-            <w:shd w:fill="EAF0F3"/>
-          </w:tcPr>
-          <w:p>
-            <w:r>
-              <w:rPr>
-                <w:b/>
-                <w:sz w:val="18"/>
-              </w:rPr>
-              <w:t>Action and completion condition</w:t>
-            </w:r>
-          </w:p>
-        </w:tc>
-        <w:tc>
-          <w:tcPr>
-            <w:tcW w:type="dxa" w:w="2736"/>
-            <w:shd w:fill="EAF0F3"/>
-          </w:tcPr>
-          <w:p>
-            <w:r>
-              <w:rPr>
-                <w:b/>
-                <w:sz w:val="18"/>
-              </w:rPr>
-              <w:t>Accountable owner</w:t>
-            </w:r>
-          </w:p>
-        </w:tc>
         <w:tc>
           <w:tcPr>
             <w:tcW w:type="dxa" w:w="1440"/>
@@ -374,7 +74,22 @@
                 <w:b/>
                 <w:sz w:val="18"/>
               </w:rPr>
-              <w:t>Target</w:t>
+              <w:t>Area</w:t>
+            </w:r>
+          </w:p>
+        </w:tc>
+        <w:tc>
+          <w:tcPr>
+            <w:tcW w:type="dxa" w:w="8640"/>
+            <w:shd w:fill="EAF0F3"/>
+          </w:tcPr>
+          <w:p>
+            <w:r>
+              <w:rPr>
+                <w:b/>
+                <w:sz w:val="18"/>
+              </w:rPr>
+              <w:t>Finding and next check</w:t>
             </w:r>
           </w:p>
         </w:tc>
@@ -383,56 +98,6 @@
         <w:trPr>
           <w:cantSplit/>
         </w:trPr>
-        <w:tc>
-          <w:tcPr>
-            <w:tcW w:type="dxa" w:w="5904"/>
-            <w:vAlign w:val="center"/>
-            <w:tcMar>
-              <w:top w:w="90" w:type="dxa"/>
-              <w:bottom w:w="90" w:type="dxa"/>
-              <w:start w:w="90" w:type="dxa"/>
-              <w:end w:w="90" w:type="dxa"/>
-            </w:tcMar>
-          </w:tcPr>
-          <w:p>
-            <w:pPr>
-              <w:spacing w:after="60"/>
-            </w:pPr>
-            <w:r>
-              <w:rPr>
-                <w:sz w:val="20"/>
-              </w:rPr>
-              <w:t>A01  Obtain West and Southeast evidence and regional responses</w:t>
-              <w:br/>
-              <w:t>F01. Both extracts are registered with source dates, coverage and responses to the diagnostic questions.</w:t>
-            </w:r>
-          </w:p>
-        </w:tc>
-        <w:tc>
-          <w:tcPr>
-            <w:tcW w:type="dxa" w:w="2736"/>
-            <w:vAlign w:val="center"/>
-            <w:tcMar>
-              <w:top w:w="90" w:type="dxa"/>
-              <w:bottom w:w="90" w:type="dxa"/>
-              <w:start w:w="90" w:type="dxa"/>
-              <w:end w:w="90" w:type="dxa"/>
-            </w:tcMar>
-          </w:tcPr>
-          <w:p>
-            <w:pPr>
-              <w:spacing w:after="60"/>
-            </w:pPr>
-            <w:r>
-              <w:rPr>
-                <w:sz w:val="20"/>
-              </w:rPr>
-              <w:t>Northstar regional leads</w:t>
-              <w:br/>
-              <w:t>Coordinate: Avery Ross</w:t>
-            </w:r>
-          </w:p>
-        </w:tc>
         <w:tc>
           <w:tcPr>
             <w:tcW w:type="dxa" w:w="1440"/>
@@ -452,18 +117,13 @@
               <w:rPr>
                 <w:sz w:val="20"/>
               </w:rPr>
-              <w:t>September 9</w:t>
+              <w:t>Coverage</w:t>
             </w:r>
           </w:p>
         </w:tc>
-      </w:tr>
-      <w:tr>
-        <w:trPr>
-          <w:cantSplit/>
-        </w:trPr>
         <w:tc>
           <w:tcPr>
-            <w:tcW w:type="dxa" w:w="5904"/>
+            <w:tcW w:type="dxa" w:w="8640"/>
             <w:vAlign w:val="center"/>
             <w:tcMar>
               <w:top w:w="90" w:type="dxa"/>
@@ -480,37 +140,15 @@
               <w:rPr>
                 <w:sz w:val="20"/>
               </w:rPr>
-              <w:t>A02  Validate Northeast’s missing decision owners</w:t>
-              <w:br/>
-              <w:t>F02. Observed owners and their supporting records are confirmed; disputes remain identified separately.</w:t>
+              <w:t>Six of eight regions received. Obtain West and Southeast before an eight-region conclusion.</w:t>
             </w:r>
           </w:p>
         </w:tc>
-        <w:tc>
-          <w:tcPr>
-            <w:tcW w:type="dxa" w:w="2736"/>
-            <w:vAlign w:val="center"/>
-            <w:tcMar>
-              <w:top w:w="90" w:type="dxa"/>
-              <w:bottom w:w="90" w:type="dxa"/>
-              <w:start w:w="90" w:type="dxa"/>
-              <w:end w:w="90" w:type="dxa"/>
-            </w:tcMar>
-          </w:tcPr>
-          <w:p>
-            <w:pPr>
-              <w:spacing w:after="60"/>
-            </w:pPr>
-            <w:r>
-              <w:rPr>
-                <w:sz w:val="20"/>
-              </w:rPr>
-              <w:t>Northeast regional lead</w:t>
-              <w:br/>
-              <w:t>Coordinate: Avery Ross</w:t>
-            </w:r>
-          </w:p>
-        </w:tc>
+      </w:tr>
+      <w:tr>
+        <w:trPr>
+          <w:cantSplit/>
+        </w:trPr>
         <w:tc>
           <w:tcPr>
             <w:tcW w:type="dxa" w:w="1440"/>
@@ -530,18 +168,13 @@
               <w:rPr>
                 <w:sz w:val="20"/>
               </w:rPr>
-              <w:t>September 9</w:t>
+              <w:t>Ownership</w:t>
             </w:r>
           </w:p>
         </w:tc>
-      </w:tr>
-      <w:tr>
-        <w:trPr>
-          <w:cantSplit/>
-        </w:trPr>
         <w:tc>
           <w:tcPr>
-            <w:tcW w:type="dxa" w:w="5904"/>
+            <w:tcW w:type="dxa" w:w="8640"/>
             <w:vAlign w:val="center"/>
             <w:tcMar>
               <w:top w:w="90" w:type="dxa"/>
@@ -558,37 +191,15 @@
               <w:rPr>
                 <w:sz w:val="20"/>
               </w:rPr>
-              <w:t>A03  Confirm Central’s inventory or replace it</w:t>
-              <w:br/>
-              <w:t>F03. A current extract or dated confirmation explains which entries remain valid and what changed.</w:t>
+              <w:t>Northeast owner fields are incomplete. Validate observed owners; do not infer that the roles are unassigned.</w:t>
             </w:r>
           </w:p>
         </w:tc>
-        <w:tc>
-          <w:tcPr>
-            <w:tcW w:type="dxa" w:w="2736"/>
-            <w:vAlign w:val="center"/>
-            <w:tcMar>
-              <w:top w:w="90" w:type="dxa"/>
-              <w:bottom w:w="90" w:type="dxa"/>
-              <w:start w:w="90" w:type="dxa"/>
-              <w:end w:w="90" w:type="dxa"/>
-            </w:tcMar>
-          </w:tcPr>
-          <w:p>
-            <w:pPr>
-              <w:spacing w:after="60"/>
-            </w:pPr>
-            <w:r>
-              <w:rPr>
-                <w:sz w:val="20"/>
-              </w:rPr>
-              <w:t>Central regional lead</w:t>
-              <w:br/>
-              <w:t>Coordinate: Avery Ross</w:t>
-            </w:r>
-          </w:p>
-        </w:tc>
+      </w:tr>
+      <w:tr>
+        <w:trPr>
+          <w:cantSplit/>
+        </w:trPr>
         <w:tc>
           <w:tcPr>
             <w:tcW w:type="dxa" w:w="1440"/>
@@ -608,18 +219,13 @@
               <w:rPr>
                 <w:sz w:val="20"/>
               </w:rPr>
-              <w:t>September 9</w:t>
+              <w:t>Currency</w:t>
             </w:r>
           </w:p>
         </w:tc>
-      </w:tr>
-      <w:tr>
-        <w:trPr>
-          <w:cantSplit/>
-        </w:trPr>
         <w:tc>
           <w:tcPr>
-            <w:tcW w:type="dxa" w:w="5904"/>
+            <w:tcW w:type="dxa" w:w="8640"/>
             <w:vAlign w:val="center"/>
             <w:tcMar>
               <w:top w:w="90" w:type="dxa"/>
@@ -636,57 +242,7 @@
               <w:rPr>
                 <w:sz w:val="20"/>
               </w:rPr>
-              <w:t>A04  Review the evidence exceptions before the baseline gate</w:t>
-              <w:br/>
-              <w:t>F01–F03. The diagnostic baseline records resolved gaps, remaining conditions and Margaret’s acceptance decision.</w:t>
-            </w:r>
-          </w:p>
-        </w:tc>
-        <w:tc>
-          <w:tcPr>
-            <w:tcW w:type="dxa" w:w="2736"/>
-            <w:vAlign w:val="center"/>
-            <w:tcMar>
-              <w:top w:w="90" w:type="dxa"/>
-              <w:bottom w:w="90" w:type="dxa"/>
-              <w:start w:w="90" w:type="dxa"/>
-              <w:end w:w="90" w:type="dxa"/>
-            </w:tcMar>
-          </w:tcPr>
-          <w:p>
-            <w:pPr>
-              <w:spacing w:after="60"/>
-            </w:pPr>
-            <w:r>
-              <w:rPr>
-                <w:sz w:val="20"/>
-              </w:rPr>
-              <w:t>Sofia Patel</w:t>
-              <w:br/>
-              <w:t>Coordinate: Margaret Whitfield</w:t>
-            </w:r>
-          </w:p>
-        </w:tc>
-        <w:tc>
-          <w:tcPr>
-            <w:tcW w:type="dxa" w:w="1440"/>
-            <w:vAlign w:val="center"/>
-            <w:tcMar>
-              <w:top w:w="90" w:type="dxa"/>
-              <w:bottom w:w="90" w:type="dxa"/>
-              <w:start w:w="90" w:type="dxa"/>
-              <w:end w:w="90" w:type="dxa"/>
-            </w:tcMar>
-          </w:tcPr>
-          <w:p>
-            <w:pPr>
-              <w:spacing w:after="60"/>
-            </w:pPr>
-            <w:r>
-              <w:rPr>
-                <w:sz w:val="20"/>
-              </w:rPr>
-              <w:t>September 11</w:t>
+              <w:t>Central’s inventory is from the prior quarter. Avery reports the process is unchanged; dated confirmation remains open.</w:t>
             </w:r>
           </w:p>
         </w:tc>
@@ -697,80 +253,47 @@
         <w:pStyle w:val="Heading1"/>
       </w:pPr>
       <w:r>
-        <w:t>Reviewed revision</w:t>
-      </w:r>
-    </w:p>
-    <w:p>
-      <w:r>
-        <w:t>Sofia’s review of revision 1 challenged the jump from evidence received to design readiness. Revision 2 makes each finding’s decision consequence and release condition explicit, assigns follow-up owners and dates, and prevents a six-region diagnostic from being presented as an eight-region conclusion. Approval of the report does not close the client’s outstanding evidence actions.</w:t>
+        <w:t>Next actions</w:t>
       </w:r>
     </w:p>
     <w:p>
       <w:pPr>
-        <w:pStyle w:val="Heading1"/>
+        <w:pStyle w:val="ListBullet"/>
       </w:pPr>
       <w:r>
-        <w:t>Source register</w:t>
+        <w:t>Regional leads: provide missing extracts and validate owners by September 9; Avery coordinates.</w:t>
+      </w:r>
+    </w:p>
+    <w:p>
+      <w:pPr>
+        <w:pStyle w:val="ListBullet"/>
+      </w:pPr>
+      <w:r>
+        <w:t>Central lead: confirm the current process and source period by September 9.</w:t>
+      </w:r>
+    </w:p>
+    <w:p>
+      <w:pPr>
+        <w:pStyle w:val="ListBullet"/>
+      </w:pPr>
+      <w:r>
+        <w:t>Sofia: review evidence exceptions before Margaret’s September 11 baseline decision.</w:t>
       </w:r>
     </w:p>
     <w:p>
       <w:r>
         <w:rPr>
-          <w:b/>
           <w:sz w:val="20"/>
         </w:rPr>
-        <w:t xml:space="preserve">S01  NS-DATA01 · Regional evidence register. </w:t>
-      </w:r>
-      <w:r>
-        <w:rPr>
-          <w:sz w:val="20"/>
-        </w:rPr>
-        <w:t>Northstar evidence: receipt status, ownership exceptions and source periods. Reviewed September 7, 2026.</w:t>
+        <w:t>Revision 2 states the design decisions on hold. Sofia approved the report; the client’s evidence actions remain open.</w:t>
       </w:r>
     </w:p>
     <w:p>
       <w:r>
         <w:rPr>
-          <w:b/>
-          <w:sz w:val="20"/>
+          <w:sz w:val="18"/>
         </w:rPr>
-        <w:t xml:space="preserve">S02  Approved engagement plan v1 · NS-D01 / G1. </w:t>
-      </w:r>
-      <w:r>
-        <w:rPr>
-          <w:sz w:val="20"/>
-        </w:rPr>
-        <w:t>Assignment: Avery, 36 hours, September 7; Sofia reviews before the September 11 diagnostic baseline.</w:t>
-      </w:r>
-    </w:p>
-    <w:p>
-      <w:r>
-        <w:rPr>
-          <w:b/>
-          <w:sz w:val="20"/>
-        </w:rPr>
-        <w:t xml:space="preserve">S03  Data Readiness Assessment · Practice library. </w:t>
-      </w:r>
-      <w:r>
-        <w:rPr>
-          <w:sz w:val="20"/>
-        </w:rPr>
-        <w:t>Firm method: coverage, currency, completeness, traceability and the report structure.</w:t>
-      </w:r>
-    </w:p>
-    <w:p>
-      <w:r>
-        <w:rPr>
-          <w:b/>
-          <w:sz w:val="20"/>
-        </w:rPr>
-        <w:t xml:space="preserve">S04  Evidence review guidance · Shared by Sofia. </w:t>
-      </w:r>
-      <w:r>
-        <w:rPr>
-          <w:sz w:val="20"/>
-        </w:rPr>
-        <w:t>Approved guidance on observed versus proposed ownership, source dates and unresolved conflicts. Informs the method; does not establish facts about Northstar.</w:t>
+        <w:t>Basis: NS-DATA01 · NS-C01: Avery’s September 7 client conversation, confirmation pending · Approved plan v1 · Practice assessment method</w:t>
       </w:r>
     </w:p>
     <w:sectPr>

</xml_diff>